<commit_message>
Pre-populate leader form; add site credits to landing page
- admin-leader.html: on club selection, fetch current public values
  via get-club and fill every editable field (Short Blurb, Long
  Description, Vibe, Tags, all meeting fields, Member Count,
  YouTube URLs, External Website, TeamReach). Leaders edit in place
  instead of retyping. Added a helper note clarifying that blank =
  keep existing value (clearing a field still requires emailing Rick).

- index.html / styles.css: small credits line in the landing-page
  footer crediting Rick, Claude AI (Anthropic), Netlify, Airtable.
  Sister pages unchanged.

Co-Authored-By: Claude Opus 4.7 <noreply@anthropic.com>
</commit_message>
<xml_diff>
--- a/CLAUDE.docx
+++ b/CLAUDE.docx
@@ -195,7 +195,7 @@
         <w:rPr>
           <w:rStyle w:val="VerbatimChar"/>
         </w:rPr>
-        <w:t xml:space="preserve">DenverRick/hilltop-clubs</w:t>
+        <w:t xml:space="preserve">DenverRick/HIlltop-clubs</w:t>
       </w:r>
       <w:r>
         <w:t xml:space="preserve">. Custom domain</w:t>
@@ -207,10 +207,37 @@
         <w:rPr>
           <w:rStyle w:val="VerbatimChar"/>
         </w:rPr>
-        <w:t xml:space="preserve">hilltop-clubs.org</w:t>
-      </w:r>
-      <w:r>
-        <w:t xml:space="preserve">.</w:t>
+        <w:t xml:space="preserve">hilltopclubs.org</w:t>
+      </w:r>
+      <w:r>
+        <w:t xml:space="preserve"> </w:t>
+      </w:r>
+      <w:r>
+        <w:t xml:space="preserve">(Cloudflare-registered, DNS-only — apex A record</w:t>
+      </w:r>
+      <w:r>
+        <w:t xml:space="preserve"> </w:t>
+      </w:r>
+      <w:r>
+        <w:rPr>
+          <w:rStyle w:val="VerbatimChar"/>
+        </w:rPr>
+        <w:t xml:space="preserve">75.2.60.5</w:t>
+      </w:r>
+      <w:r>
+        <w:t xml:space="preserve">, www CNAME to</w:t>
+      </w:r>
+      <w:r>
+        <w:t xml:space="preserve"> </w:t>
+      </w:r>
+      <w:r>
+        <w:rPr>
+          <w:rStyle w:val="VerbatimChar"/>
+        </w:rPr>
+        <w:t xml:space="preserve">hilltop-clubs.netlify.app</w:t>
+      </w:r>
+      <w:r>
+        <w:t xml:space="preserve">). Let’s Encrypt cert auto-managed by Netlify.</w:t>
       </w:r>
     </w:p>
     <w:bookmarkEnd w:id="9"/>
@@ -780,7 +807,19 @@
         <w:t xml:space="preserve"> </w:t>
       </w:r>
       <w:r>
-        <w:t xml:space="preserve">Name, Slug, Primary Category (single-select, 8 buckets), Leader Name(s), Leader Email, Short Blurb, Long Description, Tags (multi), Meeting Frequency, Meeting Day, Meeting Time, Meeting Location, Member Count, Vibe / Demographics, YouTube URLs (one per line), Thumbnail Image (attachment), External Website, Active (checkbox), Last Updated (auto).</w:t>
+        <w:t xml:space="preserve">Name, Slug, Primary Category (single-select, 8 buckets), Leader Name(s), Leader Email, Short Blurb, Long Description, Tags (multi), Meeting Frequency, Meeting Day, Meeting Schedule, Meeting Time, Meeting Location, Next Meeting (date — drives the</w:t>
+      </w:r>
+      <w:r>
+        <w:t xml:space="preserve"> </w:t>
+      </w:r>
+      <w:r>
+        <w:t xml:space="preserve">“Today/Tomorrow/Meets X”</w:t>
+      </w:r>
+      <w:r>
+        <w:t xml:space="preserve"> </w:t>
+      </w:r>
+      <w:r>
+        <w:t xml:space="preserve">chip on cards), Member Count, Vibe / Demographics, YouTube URLs (one per line), Thumbnail Image (attachment), External Website, TeamReach, Active (checkbox), Last Updated (auto).</w:t>
       </w:r>
     </w:p>
     <w:p>
@@ -806,7 +845,7 @@
         <w:pStyle w:val="BodyText"/>
       </w:pPr>
       <w:r>
-        <w:t xml:space="preserve">The 8 categories: Sports &amp; Fitness, Games &amp; Cards, Arts &amp; Crafts, Music &amp; Performing Arts, Learning &amp; Discussion, Social &amp; Cultural, Service &amp; Volunteer, Special Interests / Hobbies.</w:t>
+        <w:t xml:space="preserve">The 8 categories: Sports &amp; Fitness, Games &amp; Cards, Arts &amp; Crafts, Civic, Learning &amp; Discussion, Social &amp; Cultural, Service &amp; Volunteer, Special Interests / Hobbies.</w:t>
       </w:r>
     </w:p>
     <w:bookmarkEnd w:id="13"/>

</xml_diff>